<commit_message>
added YRPO-referate and Practic
</commit_message>
<xml_diff>
--- a/AI/Lab3_SNN/Lab_SNN/Lab_3_Razuvaev_APIM-24.docx
+++ b/AI/Lab3_SNN/Lab_SNN/Lab_3_Razuvaev_APIM-24.docx
@@ -1602,7 +1602,6 @@
         <w:ind w:firstLine="0"/>
         <w:jc w:val="center"/>
       </w:pPr>
-      <w:bookmarkStart w:id="0" w:name="_GoBack"/>
       <w:r>
         <w:rPr>
           <w:noProof/>
@@ -1658,7 +1657,6 @@
           </wp:inline>
         </w:drawing>
       </w:r>
-      <w:bookmarkEnd w:id="0"/>
     </w:p>
     <w:p>
       <w:pPr>
@@ -2563,52 +2561,8 @@
         <w:ind w:firstLine="0"/>
         <w:jc w:val="center"/>
       </w:pPr>
-      <w:r>
-        <w:rPr>
-          <w:noProof/>
-          <w:lang w:eastAsia="ru-RU"/>
-        </w:rPr>
-        <w:drawing>
-          <wp:inline distT="0" distB="0" distL="0" distR="0" wp14:anchorId="3C312C84" wp14:editId="783B69E8">
-            <wp:extent cx="3438525" cy="2200275"/>
-            <wp:effectExtent l="19050" t="19050" r="28575" b="28575"/>
-            <wp:docPr id="11" name="Рисунок 11"/>
-            <wp:cNvGraphicFramePr>
-              <a:graphicFrameLocks xmlns:a="http://schemas.openxmlformats.org/drawingml/2006/main" noChangeAspect="1"/>
-            </wp:cNvGraphicFramePr>
-            <a:graphic xmlns:a="http://schemas.openxmlformats.org/drawingml/2006/main">
-              <a:graphicData uri="http://schemas.openxmlformats.org/drawingml/2006/picture">
-                <pic:pic xmlns:pic="http://schemas.openxmlformats.org/drawingml/2006/picture">
-                  <pic:nvPicPr>
-                    <pic:cNvPr id="1" name=""/>
-                    <pic:cNvPicPr/>
-                  </pic:nvPicPr>
-                  <pic:blipFill>
-                    <a:blip r:embed="rId12"/>
-                    <a:stretch>
-                      <a:fillRect/>
-                    </a:stretch>
-                  </pic:blipFill>
-                  <pic:spPr>
-                    <a:xfrm>
-                      <a:off x="0" y="0"/>
-                      <a:ext cx="3438525" cy="2200275"/>
-                    </a:xfrm>
-                    <a:prstGeom prst="rect">
-                      <a:avLst/>
-                    </a:prstGeom>
-                    <a:ln w="19050">
-                      <a:solidFill>
-                        <a:schemeClr val="tx1"/>
-                      </a:solidFill>
-                    </a:ln>
-                  </pic:spPr>
-                </pic:pic>
-              </a:graphicData>
-            </a:graphic>
-          </wp:inline>
-        </w:drawing>
-      </w:r>
+      <w:bookmarkStart w:id="0" w:name="_GoBack"/>
+      <w:bookmarkEnd w:id="0"/>
     </w:p>
     <w:p>
       <w:pPr>
@@ -2638,7 +2592,7 @@
                     </pic:cNvPicPr>
                   </pic:nvPicPr>
                   <pic:blipFill>
-                    <a:blip r:embed="rId13">
+                    <a:blip r:embed="rId12">
                       <a:extLst>
                         <a:ext uri="{28A0092B-C50C-407E-A947-70E740481C1C}">
                           <a14:useLocalDpi xmlns:a14="http://schemas.microsoft.com/office/drawing/2010/main" val="0"/>
@@ -2763,7 +2717,7 @@
                     </pic:cNvPicPr>
                   </pic:nvPicPr>
                   <pic:blipFill rotWithShape="1">
-                    <a:blip r:embed="rId14">
+                    <a:blip r:embed="rId13">
                       <a:extLst>
                         <a:ext uri="{28A0092B-C50C-407E-A947-70E740481C1C}">
                           <a14:useLocalDpi xmlns:a14="http://schemas.microsoft.com/office/drawing/2010/main" val="0"/>
@@ -2807,14 +2761,23 @@
         <w:jc w:val="center"/>
       </w:pPr>
       <w:r>
-        <w:lastRenderedPageBreak/>
         <w:t xml:space="preserve">Рисунок </w:t>
       </w:r>
-      <w:fldSimple w:instr=" SEQ Рисунок \* Arabic ">
-        <w:r>
-          <w:t>8</w:t>
-        </w:r>
-      </w:fldSimple>
+      <w:r>
+        <w:fldChar w:fldCharType="begin"/>
+      </w:r>
+      <w:r>
+        <w:instrText xml:space="preserve"> SEQ Рисунок \* Arabic </w:instrText>
+      </w:r>
+      <w:r>
+        <w:fldChar w:fldCharType="separate"/>
+      </w:r>
+      <w:r>
+        <w:t>8</w:t>
+      </w:r>
+      <w:r>
+        <w:fldChar w:fldCharType="end"/>
+      </w:r>
       <w:r>
         <w:t xml:space="preserve"> - Результаты моделирования</w:t>
       </w:r>
@@ -2884,6 +2847,7 @@
         <w:rPr>
           <w:rStyle w:val="a4"/>
         </w:rPr>
+        <w:lastRenderedPageBreak/>
         <w:t>Включение режима ввода потенциала с «бегунка»</w:t>
       </w:r>
       <w:r>
@@ -5025,7 +4989,7 @@
 </file>
 
 <file path=customXml/itemProps1.xml><?xml version="1.0" encoding="utf-8"?>
-<ds:datastoreItem xmlns:ds="http://schemas.openxmlformats.org/officeDocument/2006/customXml" ds:itemID="{35E6928D-FA34-436E-B449-DAF2E775A0C5}">
+<ds:datastoreItem xmlns:ds="http://schemas.openxmlformats.org/officeDocument/2006/customXml" ds:itemID="{BA2B6034-59F2-45ED-AC64-3EE604E92E5E}">
   <ds:schemaRefs>
     <ds:schemaRef ds:uri="http://schemas.openxmlformats.org/officeDocument/2006/bibliography"/>
   </ds:schemaRefs>

</xml_diff>